<commit_message>
report: fold real FPA-FOD T3 results (ignition AUPRC 0.72 vs 0.43; BA CRPS +0.5%)
</commit_message>
<xml_diff>
--- a/VHAGAR_Technical_Report.docx
+++ b/VHAGAR_Technical_Report.docx
@@ -5596,6 +5596,17 @@
     </w:p>
     <w:p>
       <w:pPr>
+        <w:spacing w:after="120" w:line="276"/>
+      </w:pPr>
+      <w:r>
+        <w:rPr>
+          <w:rFonts w:ascii="Times New Roman" w:hAnsi="Times New Roman" w:eastAsia="Times New Roman"/>
+        </w:rPr>
+        <w:t>Real-data results (2026-09-20). Both T3 heads were trained and evaluated on the real FPA-FOD corpus (455,864 CONUS fires, 2015 to 2020) with leakage-safe protocols. The ignition occurrence climatology reaches temporal-holdout AUPRC 0.72 against a 0.43 base rate (Brier 0.194 versus 0.245), evidence that historical persistence carries real skill; on spatially held-out 5-degree blocks it ties the base rate (AUPRC 0.71), the honest limit that predicting ignition in unseen locations needs weather and fuel covariates, which remains future work. The conditional burned-area size model, using cause and season features only, improves on the size climatology by just 0.5 percent CRPS (45.89 versus 46.14; fold-to-fold RMSE 1290 plus or minus 363 confirms the tail instability that motivates CRPS over RMSE), the honest finding that fire size is governed by weather, fuel, and suppression rather than cause and season.</w:t>
+      </w:r>
+    </w:p>
+    <w:p>
+      <w:pPr>
         <w:pStyle w:val="Heading1"/>
         <w:spacing w:after="120" w:before="280"/>
       </w:pPr>
@@ -7476,7 +7487,7 @@
         <w:rPr>
           <w:color w:val="111418"/>
         </w:rPr>
-        <w:t xml:space="preserve">GET /v1/danger: the three T3 quantities kept separate (FWI and class, ignition probability, expected burned area), with the models trained lazily on the synthetic danger scenarios and cached.</w:t>
+        <w:t>GET /v1/danger: the three T3 quantities kept separate (FWI and class, ignition probability, expected burned area). Ignition and expected burned area are now served from models trained on real FPA-FOD records (455,864 fires, CONUS 2015 to 2020): a cause-and-season occurrence climatology for ignition and a conditional fire-size distribution for burned area, with the synthetic-scenario models retained as a fallback.</w:t>
       </w:r>
     </w:p>
     <w:p>

</xml_diff>

<commit_message>
report: fold in T4 MTBS mapped-perimeter validation (IoU 0.46 front vs 0.50 circle; wins on wind-driven fires)
</commit_message>
<xml_diff>
--- a/VHAGAR_Technical_Report.docx
+++ b/VHAGAR_Technical_Report.docx
@@ -6292,6 +6292,15 @@
       <w:pPr/>
       <w:r>
         <w:t>Update, real-data forward run, a held-out-detection check, not a perimeter validation. The assimilation loop was also run on real NASA FIRMS VIIRS timed detections (August 2026) for the six largest western United States fire complexes, calibrating the per-fire rate-of-spread scale on the early detections and scoring the forecast against held-out later detections on new burn only. The mean held-out Sorensen coefficient is 0.30, with mean probability of detection 1.00 and mean false-alarm ratio 0.82, which lands in the real-skill band predicted above and far below the optimistic synthetic average precision of 0.77. The honest failure mode is over-prediction: the forecast recalls essentially all new burn but over-spreads, which points to real fuels and a suppression term. Scope: the truth is coarse, roughly 1 kilometre, held-out VIIRS active-fire detections, a recall proxy, not a mapped future perimeter or an incremental burned-area mask; the run uses a nominal rate-of-spread prior (only the scalar scale is calibrated from real data) and half-degree FIRMS detection clusters. See scripts/t4_real_viirs.py.</w:t>
+      </w:r>
+    </w:p>
+    <w:p>
+      <w:pPr/>
+      <w:r>
+        <w:rPr>
+          <w:rFonts w:ascii="Times New Roman" w:hAnsi="Times New Roman" w:eastAsia="Times New Roman"/>
+        </w:rPr>
+        <w:t>Update, mapped-perimeter validation against MTBS. The front was also scored against real mapped fire perimeters, not only detection proxies, using the MTBS 2021 CONUS severity raster for five large western fires (Dixie, Caldor, Bootleg, Monument, River Complex, about 800,000 hectares total). The elliptical arrival-time front's reconstructed perimeter is compared to the real burned mask by intersection-over-union and Sorensen against an equal-area circle baseline. Honest scope: this is a shape-family adequacy test, the final area, dominant axis and length-to-breadth are taken from the truth mask, so only the front geometry is under test; it is not a blind next-day forecast. The result is an honest split decision: mean intersection-over-union is 0.46 for the front against 0.50 for the circle, so the single-wind ellipse does not win on average, because large multi-day footprints trend round. But it beats the circle on every strongly wind-elongated fire (Dixie length-to-breadth 2.3, 0.42 against 0.36; Caldor 2.6, 0.59 against 0.51; River Complex 1.9, 0.54 against 0.53) and loses only on the compact ones (Bootleg 1.7, Monument 1.5). The reading is that a single-wind ellipse earns its keep precisely when the fire is wind-driven; reproducing compact multi-day complexes needs time-resolved perimeters with time-varying wind and fuel breaks. See vhagar.eval.perimeter_shape and scripts/t4_mtbs_perimeter.py.</w:t>
       </w:r>
     </w:p>
     <w:p>

</xml_diff>